<commit_message>
Corrected your mice code, however use efficacy not efficacy_STD
</commit_message>
<xml_diff>
--- a/Output/Ria_correlation_matrix.docx
+++ b/Output/Ria_correlation_matrix.docx
@@ -63,6 +63,7 @@
           <w:trHeight w:val="360" w:hRule="auto"/>
           <w:tblHeader/>
         </w:trPr>
+        header1
         <w:tc>
           <w:tcPr>
             <w:tcBorders>
@@ -82,7 +83,6 @@
           </w:tcPr>
           <w:p>
             <w:pPr>
-              <w:pStyle w:val="Normal"/>
               <w:jc w:val="left"/>
               <w:pBdr>
                 <w:bottom w:val="none" w:sz="0" w:space="0" w:color="000000"/>
@@ -137,7 +137,6 @@
           </w:tcPr>
           <w:p>
             <w:pPr>
-              <w:pStyle w:val="Normal"/>
               <w:jc w:val="center"/>
               <w:pBdr>
                 <w:bottom w:val="none" w:sz="0" w:space="0" w:color="000000"/>
@@ -192,7 +191,6 @@
           </w:tcPr>
           <w:p>
             <w:pPr>
-              <w:pStyle w:val="Normal"/>
               <w:jc w:val="center"/>
               <w:pBdr>
                 <w:bottom w:val="none" w:sz="0" w:space="0" w:color="000000"/>
@@ -247,7 +245,6 @@
           </w:tcPr>
           <w:p>
             <w:pPr>
-              <w:pStyle w:val="Normal"/>
               <w:jc w:val="center"/>
               <w:pBdr>
                 <w:bottom w:val="none" w:sz="0" w:space="0" w:color="000000"/>
@@ -302,7 +299,6 @@
           </w:tcPr>
           <w:p>
             <w:pPr>
-              <w:pStyle w:val="Normal"/>
               <w:jc w:val="center"/>
               <w:pBdr>
                 <w:bottom w:val="none" w:sz="0" w:space="0" w:color="000000"/>
@@ -357,7 +353,6 @@
           </w:tcPr>
           <w:p>
             <w:pPr>
-              <w:pStyle w:val="Normal"/>
               <w:jc w:val="center"/>
               <w:pBdr>
                 <w:bottom w:val="none" w:sz="0" w:space="0" w:color="000000"/>
@@ -412,7 +407,6 @@
           </w:tcPr>
           <w:p>
             <w:pPr>
-              <w:pStyle w:val="Normal"/>
               <w:jc w:val="center"/>
               <w:pBdr>
                 <w:bottom w:val="none" w:sz="0" w:space="0" w:color="000000"/>
@@ -467,7 +461,6 @@
           </w:tcPr>
           <w:p>
             <w:pPr>
-              <w:pStyle w:val="Normal"/>
               <w:jc w:val="center"/>
               <w:pBdr>
                 <w:bottom w:val="none" w:sz="0" w:space="0" w:color="000000"/>
@@ -522,7 +515,6 @@
           </w:tcPr>
           <w:p>
             <w:pPr>
-              <w:pStyle w:val="Normal"/>
               <w:jc w:val="center"/>
               <w:pBdr>
                 <w:bottom w:val="none" w:sz="0" w:space="0" w:color="000000"/>
@@ -563,6 +555,7 @@
         <w:trPr>
           <w:trHeight w:val="360" w:hRule="auto"/>
         </w:trPr>
+        body1
         <w:tc>
           <w:tcPr>
             <w:tcBorders>
@@ -582,7 +575,6 @@
           </w:tcPr>
           <w:p>
             <w:pPr>
-              <w:pStyle w:val="Normal"/>
               <w:jc w:val="left"/>
               <w:pBdr>
                 <w:bottom w:val="none" w:sz="0" w:space="0" w:color="000000"/>
@@ -637,7 +629,6 @@
           </w:tcPr>
           <w:p>
             <w:pPr>
-              <w:pStyle w:val="Normal"/>
               <w:jc w:val="center"/>
               <w:pBdr>
                 <w:bottom w:val="none" w:sz="0" w:space="0" w:color="000000"/>
@@ -692,7 +683,6 @@
           </w:tcPr>
           <w:p>
             <w:pPr>
-              <w:pStyle w:val="Normal"/>
               <w:jc w:val="center"/>
               <w:pBdr>
                 <w:bottom w:val="none" w:sz="0" w:space="0" w:color="000000"/>
@@ -747,7 +737,6 @@
           </w:tcPr>
           <w:p>
             <w:pPr>
-              <w:pStyle w:val="Normal"/>
               <w:jc w:val="center"/>
               <w:pBdr>
                 <w:bottom w:val="none" w:sz="0" w:space="0" w:color="000000"/>
@@ -802,7 +791,6 @@
           </w:tcPr>
           <w:p>
             <w:pPr>
-              <w:pStyle w:val="Normal"/>
               <w:jc w:val="center"/>
               <w:pBdr>
                 <w:bottom w:val="none" w:sz="0" w:space="0" w:color="000000"/>
@@ -857,7 +845,6 @@
           </w:tcPr>
           <w:p>
             <w:pPr>
-              <w:pStyle w:val="Normal"/>
               <w:jc w:val="center"/>
               <w:pBdr>
                 <w:bottom w:val="none" w:sz="0" w:space="0" w:color="000000"/>
@@ -912,7 +899,6 @@
           </w:tcPr>
           <w:p>
             <w:pPr>
-              <w:pStyle w:val="Normal"/>
               <w:jc w:val="center"/>
               <w:pBdr>
                 <w:bottom w:val="none" w:sz="0" w:space="0" w:color="000000"/>
@@ -967,7 +953,6 @@
           </w:tcPr>
           <w:p>
             <w:pPr>
-              <w:pStyle w:val="Normal"/>
               <w:jc w:val="center"/>
               <w:pBdr>
                 <w:bottom w:val="none" w:sz="0" w:space="0" w:color="000000"/>
@@ -1022,7 +1007,6 @@
           </w:tcPr>
           <w:p>
             <w:pPr>
-              <w:pStyle w:val="Normal"/>
               <w:jc w:val="center"/>
               <w:pBdr>
                 <w:bottom w:val="none" w:sz="0" w:space="0" w:color="000000"/>
@@ -1063,26 +1047,26 @@
         <w:trPr>
           <w:trHeight w:val="360" w:hRule="auto"/>
         </w:trPr>
-        <w:tc>
-          <w:tcPr>
-            <w:tcBorders>
-              <w:bottom w:val="none" w:sz="0" w:space="0" w:color="000000"/>
-              <w:top w:val="none" w:sz="0" w:space="0" w:color="000000"/>
-              <w:left w:val="none" w:sz="0" w:space="0" w:color="000000"/>
-              <w:right w:val="none" w:sz="0" w:space="0" w:color="000000"/>
-            </w:tcBorders>
-            <w:shd w:val="clear" w:color="auto" w:fill="FFFFFF"/>
-            <w:tcMar>
-              <w:top w:w="0" w:type="dxa"/>
-              <w:bottom w:w="0" w:type="dxa"/>
-              <w:left w:w="0" w:type="dxa"/>
-              <w:right w:w="0" w:type="dxa"/>
-            </w:tcMar>
-            <w:vAlign w:val="center"/>
-          </w:tcPr>
-          <w:p>
-            <w:pPr>
-              <w:pStyle w:val="Normal"/>
+        body2
+        <w:tc>
+          <w:tcPr>
+            <w:tcBorders>
+              <w:bottom w:val="none" w:sz="0" w:space="0" w:color="000000"/>
+              <w:top w:val="none" w:sz="0" w:space="0" w:color="000000"/>
+              <w:left w:val="none" w:sz="0" w:space="0" w:color="000000"/>
+              <w:right w:val="none" w:sz="0" w:space="0" w:color="000000"/>
+            </w:tcBorders>
+            <w:shd w:val="clear" w:color="auto" w:fill="FFFFFF"/>
+            <w:tcMar>
+              <w:top w:w="0" w:type="dxa"/>
+              <w:bottom w:w="0" w:type="dxa"/>
+              <w:left w:w="0" w:type="dxa"/>
+              <w:right w:w="0" w:type="dxa"/>
+            </w:tcMar>
+            <w:vAlign w:val="center"/>
+          </w:tcPr>
+          <w:p>
+            <w:pPr>
               <w:jc w:val="left"/>
               <w:pBdr>
                 <w:bottom w:val="none" w:sz="0" w:space="0" w:color="000000"/>
@@ -1137,7 +1121,6 @@
           </w:tcPr>
           <w:p>
             <w:pPr>
-              <w:pStyle w:val="Normal"/>
               <w:jc w:val="center"/>
               <w:pBdr>
                 <w:bottom w:val="none" w:sz="0" w:space="0" w:color="000000"/>
@@ -1192,7 +1175,6 @@
           </w:tcPr>
           <w:p>
             <w:pPr>
-              <w:pStyle w:val="Normal"/>
               <w:jc w:val="center"/>
               <w:pBdr>
                 <w:bottom w:val="none" w:sz="0" w:space="0" w:color="000000"/>
@@ -1247,7 +1229,6 @@
           </w:tcPr>
           <w:p>
             <w:pPr>
-              <w:pStyle w:val="Normal"/>
               <w:jc w:val="center"/>
               <w:pBdr>
                 <w:bottom w:val="none" w:sz="0" w:space="0" w:color="000000"/>
@@ -1302,7 +1283,6 @@
           </w:tcPr>
           <w:p>
             <w:pPr>
-              <w:pStyle w:val="Normal"/>
               <w:jc w:val="center"/>
               <w:pBdr>
                 <w:bottom w:val="none" w:sz="0" w:space="0" w:color="000000"/>
@@ -1357,7 +1337,6 @@
           </w:tcPr>
           <w:p>
             <w:pPr>
-              <w:pStyle w:val="Normal"/>
               <w:jc w:val="center"/>
               <w:pBdr>
                 <w:bottom w:val="none" w:sz="0" w:space="0" w:color="000000"/>
@@ -1412,7 +1391,6 @@
           </w:tcPr>
           <w:p>
             <w:pPr>
-              <w:pStyle w:val="Normal"/>
               <w:jc w:val="center"/>
               <w:pBdr>
                 <w:bottom w:val="none" w:sz="0" w:space="0" w:color="000000"/>
@@ -1467,7 +1445,6 @@
           </w:tcPr>
           <w:p>
             <w:pPr>
-              <w:pStyle w:val="Normal"/>
               <w:jc w:val="center"/>
               <w:pBdr>
                 <w:bottom w:val="none" w:sz="0" w:space="0" w:color="000000"/>
@@ -1522,7 +1499,6 @@
           </w:tcPr>
           <w:p>
             <w:pPr>
-              <w:pStyle w:val="Normal"/>
               <w:jc w:val="center"/>
               <w:pBdr>
                 <w:bottom w:val="none" w:sz="0" w:space="0" w:color="000000"/>
@@ -1563,26 +1539,26 @@
         <w:trPr>
           <w:trHeight w:val="360" w:hRule="auto"/>
         </w:trPr>
-        <w:tc>
-          <w:tcPr>
-            <w:tcBorders>
-              <w:bottom w:val="none" w:sz="0" w:space="0" w:color="000000"/>
-              <w:top w:val="none" w:sz="0" w:space="0" w:color="000000"/>
-              <w:left w:val="none" w:sz="0" w:space="0" w:color="000000"/>
-              <w:right w:val="none" w:sz="0" w:space="0" w:color="000000"/>
-            </w:tcBorders>
-            <w:shd w:val="clear" w:color="auto" w:fill="FFFFFF"/>
-            <w:tcMar>
-              <w:top w:w="0" w:type="dxa"/>
-              <w:bottom w:w="0" w:type="dxa"/>
-              <w:left w:w="0" w:type="dxa"/>
-              <w:right w:w="0" w:type="dxa"/>
-            </w:tcMar>
-            <w:vAlign w:val="center"/>
-          </w:tcPr>
-          <w:p>
-            <w:pPr>
-              <w:pStyle w:val="Normal"/>
+        body3
+        <w:tc>
+          <w:tcPr>
+            <w:tcBorders>
+              <w:bottom w:val="none" w:sz="0" w:space="0" w:color="000000"/>
+              <w:top w:val="none" w:sz="0" w:space="0" w:color="000000"/>
+              <w:left w:val="none" w:sz="0" w:space="0" w:color="000000"/>
+              <w:right w:val="none" w:sz="0" w:space="0" w:color="000000"/>
+            </w:tcBorders>
+            <w:shd w:val="clear" w:color="auto" w:fill="FFFFFF"/>
+            <w:tcMar>
+              <w:top w:w="0" w:type="dxa"/>
+              <w:bottom w:w="0" w:type="dxa"/>
+              <w:left w:w="0" w:type="dxa"/>
+              <w:right w:w="0" w:type="dxa"/>
+            </w:tcMar>
+            <w:vAlign w:val="center"/>
+          </w:tcPr>
+          <w:p>
+            <w:pPr>
               <w:jc w:val="left"/>
               <w:pBdr>
                 <w:bottom w:val="none" w:sz="0" w:space="0" w:color="000000"/>
@@ -1637,7 +1613,6 @@
           </w:tcPr>
           <w:p>
             <w:pPr>
-              <w:pStyle w:val="Normal"/>
               <w:jc w:val="center"/>
               <w:pBdr>
                 <w:bottom w:val="none" w:sz="0" w:space="0" w:color="000000"/>
@@ -1692,7 +1667,6 @@
           </w:tcPr>
           <w:p>
             <w:pPr>
-              <w:pStyle w:val="Normal"/>
               <w:jc w:val="center"/>
               <w:pBdr>
                 <w:bottom w:val="none" w:sz="0" w:space="0" w:color="000000"/>
@@ -1747,7 +1721,6 @@
           </w:tcPr>
           <w:p>
             <w:pPr>
-              <w:pStyle w:val="Normal"/>
               <w:jc w:val="center"/>
               <w:pBdr>
                 <w:bottom w:val="none" w:sz="0" w:space="0" w:color="000000"/>
@@ -1802,7 +1775,6 @@
           </w:tcPr>
           <w:p>
             <w:pPr>
-              <w:pStyle w:val="Normal"/>
               <w:jc w:val="center"/>
               <w:pBdr>
                 <w:bottom w:val="none" w:sz="0" w:space="0" w:color="000000"/>
@@ -1857,7 +1829,6 @@
           </w:tcPr>
           <w:p>
             <w:pPr>
-              <w:pStyle w:val="Normal"/>
               <w:jc w:val="center"/>
               <w:pBdr>
                 <w:bottom w:val="none" w:sz="0" w:space="0" w:color="000000"/>
@@ -1912,7 +1883,6 @@
           </w:tcPr>
           <w:p>
             <w:pPr>
-              <w:pStyle w:val="Normal"/>
               <w:jc w:val="center"/>
               <w:pBdr>
                 <w:bottom w:val="none" w:sz="0" w:space="0" w:color="000000"/>
@@ -1967,7 +1937,6 @@
           </w:tcPr>
           <w:p>
             <w:pPr>
-              <w:pStyle w:val="Normal"/>
               <w:jc w:val="center"/>
               <w:pBdr>
                 <w:bottom w:val="none" w:sz="0" w:space="0" w:color="000000"/>
@@ -2022,7 +1991,6 @@
           </w:tcPr>
           <w:p>
             <w:pPr>
-              <w:pStyle w:val="Normal"/>
               <w:jc w:val="center"/>
               <w:pBdr>
                 <w:bottom w:val="none" w:sz="0" w:space="0" w:color="000000"/>
@@ -2063,26 +2031,26 @@
         <w:trPr>
           <w:trHeight w:val="360" w:hRule="auto"/>
         </w:trPr>
-        <w:tc>
-          <w:tcPr>
-            <w:tcBorders>
-              <w:bottom w:val="none" w:sz="0" w:space="0" w:color="000000"/>
-              <w:top w:val="none" w:sz="0" w:space="0" w:color="000000"/>
-              <w:left w:val="none" w:sz="0" w:space="0" w:color="000000"/>
-              <w:right w:val="none" w:sz="0" w:space="0" w:color="000000"/>
-            </w:tcBorders>
-            <w:shd w:val="clear" w:color="auto" w:fill="FFFFFF"/>
-            <w:tcMar>
-              <w:top w:w="0" w:type="dxa"/>
-              <w:bottom w:w="0" w:type="dxa"/>
-              <w:left w:w="0" w:type="dxa"/>
-              <w:right w:w="0" w:type="dxa"/>
-            </w:tcMar>
-            <w:vAlign w:val="center"/>
-          </w:tcPr>
-          <w:p>
-            <w:pPr>
-              <w:pStyle w:val="Normal"/>
+        body4
+        <w:tc>
+          <w:tcPr>
+            <w:tcBorders>
+              <w:bottom w:val="none" w:sz="0" w:space="0" w:color="000000"/>
+              <w:top w:val="none" w:sz="0" w:space="0" w:color="000000"/>
+              <w:left w:val="none" w:sz="0" w:space="0" w:color="000000"/>
+              <w:right w:val="none" w:sz="0" w:space="0" w:color="000000"/>
+            </w:tcBorders>
+            <w:shd w:val="clear" w:color="auto" w:fill="FFFFFF"/>
+            <w:tcMar>
+              <w:top w:w="0" w:type="dxa"/>
+              <w:bottom w:w="0" w:type="dxa"/>
+              <w:left w:w="0" w:type="dxa"/>
+              <w:right w:w="0" w:type="dxa"/>
+            </w:tcMar>
+            <w:vAlign w:val="center"/>
+          </w:tcPr>
+          <w:p>
+            <w:pPr>
               <w:jc w:val="left"/>
               <w:pBdr>
                 <w:bottom w:val="none" w:sz="0" w:space="0" w:color="000000"/>
@@ -2137,7 +2105,6 @@
           </w:tcPr>
           <w:p>
             <w:pPr>
-              <w:pStyle w:val="Normal"/>
               <w:jc w:val="center"/>
               <w:pBdr>
                 <w:bottom w:val="none" w:sz="0" w:space="0" w:color="000000"/>
@@ -2192,7 +2159,6 @@
           </w:tcPr>
           <w:p>
             <w:pPr>
-              <w:pStyle w:val="Normal"/>
               <w:jc w:val="center"/>
               <w:pBdr>
                 <w:bottom w:val="none" w:sz="0" w:space="0" w:color="000000"/>
@@ -2247,7 +2213,6 @@
           </w:tcPr>
           <w:p>
             <w:pPr>
-              <w:pStyle w:val="Normal"/>
               <w:jc w:val="center"/>
               <w:pBdr>
                 <w:bottom w:val="none" w:sz="0" w:space="0" w:color="000000"/>
@@ -2302,7 +2267,6 @@
           </w:tcPr>
           <w:p>
             <w:pPr>
-              <w:pStyle w:val="Normal"/>
               <w:jc w:val="center"/>
               <w:pBdr>
                 <w:bottom w:val="none" w:sz="0" w:space="0" w:color="000000"/>
@@ -2357,7 +2321,6 @@
           </w:tcPr>
           <w:p>
             <w:pPr>
-              <w:pStyle w:val="Normal"/>
               <w:jc w:val="center"/>
               <w:pBdr>
                 <w:bottom w:val="none" w:sz="0" w:space="0" w:color="000000"/>
@@ -2412,7 +2375,6 @@
           </w:tcPr>
           <w:p>
             <w:pPr>
-              <w:pStyle w:val="Normal"/>
               <w:jc w:val="center"/>
               <w:pBdr>
                 <w:bottom w:val="none" w:sz="0" w:space="0" w:color="000000"/>
@@ -2467,7 +2429,6 @@
           </w:tcPr>
           <w:p>
             <w:pPr>
-              <w:pStyle w:val="Normal"/>
               <w:jc w:val="center"/>
               <w:pBdr>
                 <w:bottom w:val="none" w:sz="0" w:space="0" w:color="000000"/>
@@ -2522,7 +2483,6 @@
           </w:tcPr>
           <w:p>
             <w:pPr>
-              <w:pStyle w:val="Normal"/>
               <w:jc w:val="center"/>
               <w:pBdr>
                 <w:bottom w:val="none" w:sz="0" w:space="0" w:color="000000"/>
@@ -2563,26 +2523,26 @@
         <w:trPr>
           <w:trHeight w:val="360" w:hRule="auto"/>
         </w:trPr>
-        <w:tc>
-          <w:tcPr>
-            <w:tcBorders>
-              <w:bottom w:val="none" w:sz="0" w:space="0" w:color="000000"/>
-              <w:top w:val="none" w:sz="0" w:space="0" w:color="000000"/>
-              <w:left w:val="none" w:sz="0" w:space="0" w:color="000000"/>
-              <w:right w:val="none" w:sz="0" w:space="0" w:color="000000"/>
-            </w:tcBorders>
-            <w:shd w:val="clear" w:color="auto" w:fill="FFFFFF"/>
-            <w:tcMar>
-              <w:top w:w="0" w:type="dxa"/>
-              <w:bottom w:w="0" w:type="dxa"/>
-              <w:left w:w="0" w:type="dxa"/>
-              <w:right w:w="0" w:type="dxa"/>
-            </w:tcMar>
-            <w:vAlign w:val="center"/>
-          </w:tcPr>
-          <w:p>
-            <w:pPr>
-              <w:pStyle w:val="Normal"/>
+        body5
+        <w:tc>
+          <w:tcPr>
+            <w:tcBorders>
+              <w:bottom w:val="none" w:sz="0" w:space="0" w:color="000000"/>
+              <w:top w:val="none" w:sz="0" w:space="0" w:color="000000"/>
+              <w:left w:val="none" w:sz="0" w:space="0" w:color="000000"/>
+              <w:right w:val="none" w:sz="0" w:space="0" w:color="000000"/>
+            </w:tcBorders>
+            <w:shd w:val="clear" w:color="auto" w:fill="FFFFFF"/>
+            <w:tcMar>
+              <w:top w:w="0" w:type="dxa"/>
+              <w:bottom w:w="0" w:type="dxa"/>
+              <w:left w:w="0" w:type="dxa"/>
+              <w:right w:w="0" w:type="dxa"/>
+            </w:tcMar>
+            <w:vAlign w:val="center"/>
+          </w:tcPr>
+          <w:p>
+            <w:pPr>
               <w:jc w:val="left"/>
               <w:pBdr>
                 <w:bottom w:val="none" w:sz="0" w:space="0" w:color="000000"/>
@@ -2637,7 +2597,6 @@
           </w:tcPr>
           <w:p>
             <w:pPr>
-              <w:pStyle w:val="Normal"/>
               <w:jc w:val="center"/>
               <w:pBdr>
                 <w:bottom w:val="none" w:sz="0" w:space="0" w:color="000000"/>
@@ -2692,7 +2651,6 @@
           </w:tcPr>
           <w:p>
             <w:pPr>
-              <w:pStyle w:val="Normal"/>
               <w:jc w:val="center"/>
               <w:pBdr>
                 <w:bottom w:val="none" w:sz="0" w:space="0" w:color="000000"/>
@@ -2747,7 +2705,6 @@
           </w:tcPr>
           <w:p>
             <w:pPr>
-              <w:pStyle w:val="Normal"/>
               <w:jc w:val="center"/>
               <w:pBdr>
                 <w:bottom w:val="none" w:sz="0" w:space="0" w:color="000000"/>
@@ -2802,7 +2759,6 @@
           </w:tcPr>
           <w:p>
             <w:pPr>
-              <w:pStyle w:val="Normal"/>
               <w:jc w:val="center"/>
               <w:pBdr>
                 <w:bottom w:val="none" w:sz="0" w:space="0" w:color="000000"/>
@@ -2857,7 +2813,6 @@
           </w:tcPr>
           <w:p>
             <w:pPr>
-              <w:pStyle w:val="Normal"/>
               <w:jc w:val="center"/>
               <w:pBdr>
                 <w:bottom w:val="none" w:sz="0" w:space="0" w:color="000000"/>
@@ -2912,7 +2867,6 @@
           </w:tcPr>
           <w:p>
             <w:pPr>
-              <w:pStyle w:val="Normal"/>
               <w:jc w:val="center"/>
               <w:pBdr>
                 <w:bottom w:val="none" w:sz="0" w:space="0" w:color="000000"/>
@@ -2967,7 +2921,6 @@
           </w:tcPr>
           <w:p>
             <w:pPr>
-              <w:pStyle w:val="Normal"/>
               <w:jc w:val="center"/>
               <w:pBdr>
                 <w:bottom w:val="none" w:sz="0" w:space="0" w:color="000000"/>
@@ -3022,7 +2975,6 @@
           </w:tcPr>
           <w:p>
             <w:pPr>
-              <w:pStyle w:val="Normal"/>
               <w:jc w:val="center"/>
               <w:pBdr>
                 <w:bottom w:val="none" w:sz="0" w:space="0" w:color="000000"/>
@@ -3063,26 +3015,26 @@
         <w:trPr>
           <w:trHeight w:val="360" w:hRule="auto"/>
         </w:trPr>
-        <w:tc>
-          <w:tcPr>
-            <w:tcBorders>
-              <w:bottom w:val="none" w:sz="0" w:space="0" w:color="000000"/>
-              <w:top w:val="none" w:sz="0" w:space="0" w:color="000000"/>
-              <w:left w:val="none" w:sz="0" w:space="0" w:color="000000"/>
-              <w:right w:val="none" w:sz="0" w:space="0" w:color="000000"/>
-            </w:tcBorders>
-            <w:shd w:val="clear" w:color="auto" w:fill="FFFFFF"/>
-            <w:tcMar>
-              <w:top w:w="0" w:type="dxa"/>
-              <w:bottom w:w="0" w:type="dxa"/>
-              <w:left w:w="0" w:type="dxa"/>
-              <w:right w:w="0" w:type="dxa"/>
-            </w:tcMar>
-            <w:vAlign w:val="center"/>
-          </w:tcPr>
-          <w:p>
-            <w:pPr>
-              <w:pStyle w:val="Normal"/>
+        body6
+        <w:tc>
+          <w:tcPr>
+            <w:tcBorders>
+              <w:bottom w:val="none" w:sz="0" w:space="0" w:color="000000"/>
+              <w:top w:val="none" w:sz="0" w:space="0" w:color="000000"/>
+              <w:left w:val="none" w:sz="0" w:space="0" w:color="000000"/>
+              <w:right w:val="none" w:sz="0" w:space="0" w:color="000000"/>
+            </w:tcBorders>
+            <w:shd w:val="clear" w:color="auto" w:fill="FFFFFF"/>
+            <w:tcMar>
+              <w:top w:w="0" w:type="dxa"/>
+              <w:bottom w:w="0" w:type="dxa"/>
+              <w:left w:w="0" w:type="dxa"/>
+              <w:right w:w="0" w:type="dxa"/>
+            </w:tcMar>
+            <w:vAlign w:val="center"/>
+          </w:tcPr>
+          <w:p>
+            <w:pPr>
               <w:jc w:val="left"/>
               <w:pBdr>
                 <w:bottom w:val="none" w:sz="0" w:space="0" w:color="000000"/>
@@ -3137,7 +3089,6 @@
           </w:tcPr>
           <w:p>
             <w:pPr>
-              <w:pStyle w:val="Normal"/>
               <w:jc w:val="center"/>
               <w:pBdr>
                 <w:bottom w:val="none" w:sz="0" w:space="0" w:color="000000"/>
@@ -3192,7 +3143,6 @@
           </w:tcPr>
           <w:p>
             <w:pPr>
-              <w:pStyle w:val="Normal"/>
               <w:jc w:val="center"/>
               <w:pBdr>
                 <w:bottom w:val="none" w:sz="0" w:space="0" w:color="000000"/>
@@ -3247,7 +3197,6 @@
           </w:tcPr>
           <w:p>
             <w:pPr>
-              <w:pStyle w:val="Normal"/>
               <w:jc w:val="center"/>
               <w:pBdr>
                 <w:bottom w:val="none" w:sz="0" w:space="0" w:color="000000"/>
@@ -3302,7 +3251,6 @@
           </w:tcPr>
           <w:p>
             <w:pPr>
-              <w:pStyle w:val="Normal"/>
               <w:jc w:val="center"/>
               <w:pBdr>
                 <w:bottom w:val="none" w:sz="0" w:space="0" w:color="000000"/>
@@ -3357,7 +3305,6 @@
           </w:tcPr>
           <w:p>
             <w:pPr>
-              <w:pStyle w:val="Normal"/>
               <w:jc w:val="center"/>
               <w:pBdr>
                 <w:bottom w:val="none" w:sz="0" w:space="0" w:color="000000"/>
@@ -3412,7 +3359,6 @@
           </w:tcPr>
           <w:p>
             <w:pPr>
-              <w:pStyle w:val="Normal"/>
               <w:jc w:val="center"/>
               <w:pBdr>
                 <w:bottom w:val="none" w:sz="0" w:space="0" w:color="000000"/>
@@ -3467,7 +3413,6 @@
           </w:tcPr>
           <w:p>
             <w:pPr>
-              <w:pStyle w:val="Normal"/>
               <w:jc w:val="center"/>
               <w:pBdr>
                 <w:bottom w:val="none" w:sz="0" w:space="0" w:color="000000"/>
@@ -3522,7 +3467,6 @@
           </w:tcPr>
           <w:p>
             <w:pPr>
-              <w:pStyle w:val="Normal"/>
               <w:jc w:val="center"/>
               <w:pBdr>
                 <w:bottom w:val="none" w:sz="0" w:space="0" w:color="000000"/>
@@ -3563,26 +3507,26 @@
         <w:trPr>
           <w:trHeight w:val="360" w:hRule="auto"/>
         </w:trPr>
-        <w:tc>
-          <w:tcPr>
-            <w:tcBorders>
-              <w:bottom w:val="none" w:sz="0" w:space="0" w:color="000000"/>
-              <w:top w:val="none" w:sz="0" w:space="0" w:color="000000"/>
-              <w:left w:val="none" w:sz="0" w:space="0" w:color="000000"/>
-              <w:right w:val="none" w:sz="0" w:space="0" w:color="000000"/>
-            </w:tcBorders>
-            <w:shd w:val="clear" w:color="auto" w:fill="FFFFFF"/>
-            <w:tcMar>
-              <w:top w:w="0" w:type="dxa"/>
-              <w:bottom w:w="0" w:type="dxa"/>
-              <w:left w:w="0" w:type="dxa"/>
-              <w:right w:w="0" w:type="dxa"/>
-            </w:tcMar>
-            <w:vAlign w:val="center"/>
-          </w:tcPr>
-          <w:p>
-            <w:pPr>
-              <w:pStyle w:val="Normal"/>
+        body7
+        <w:tc>
+          <w:tcPr>
+            <w:tcBorders>
+              <w:bottom w:val="none" w:sz="0" w:space="0" w:color="000000"/>
+              <w:top w:val="none" w:sz="0" w:space="0" w:color="000000"/>
+              <w:left w:val="none" w:sz="0" w:space="0" w:color="000000"/>
+              <w:right w:val="none" w:sz="0" w:space="0" w:color="000000"/>
+            </w:tcBorders>
+            <w:shd w:val="clear" w:color="auto" w:fill="FFFFFF"/>
+            <w:tcMar>
+              <w:top w:w="0" w:type="dxa"/>
+              <w:bottom w:w="0" w:type="dxa"/>
+              <w:left w:w="0" w:type="dxa"/>
+              <w:right w:w="0" w:type="dxa"/>
+            </w:tcMar>
+            <w:vAlign w:val="center"/>
+          </w:tcPr>
+          <w:p>
+            <w:pPr>
               <w:jc w:val="left"/>
               <w:pBdr>
                 <w:bottom w:val="none" w:sz="0" w:space="0" w:color="000000"/>
@@ -3637,7 +3581,6 @@
           </w:tcPr>
           <w:p>
             <w:pPr>
-              <w:pStyle w:val="Normal"/>
               <w:jc w:val="center"/>
               <w:pBdr>
                 <w:bottom w:val="none" w:sz="0" w:space="0" w:color="000000"/>
@@ -3692,7 +3635,6 @@
           </w:tcPr>
           <w:p>
             <w:pPr>
-              <w:pStyle w:val="Normal"/>
               <w:jc w:val="center"/>
               <w:pBdr>
                 <w:bottom w:val="none" w:sz="0" w:space="0" w:color="000000"/>
@@ -3747,7 +3689,6 @@
           </w:tcPr>
           <w:p>
             <w:pPr>
-              <w:pStyle w:val="Normal"/>
               <w:jc w:val="center"/>
               <w:pBdr>
                 <w:bottom w:val="none" w:sz="0" w:space="0" w:color="000000"/>
@@ -3802,7 +3743,6 @@
           </w:tcPr>
           <w:p>
             <w:pPr>
-              <w:pStyle w:val="Normal"/>
               <w:jc w:val="center"/>
               <w:pBdr>
                 <w:bottom w:val="none" w:sz="0" w:space="0" w:color="000000"/>
@@ -3857,7 +3797,6 @@
           </w:tcPr>
           <w:p>
             <w:pPr>
-              <w:pStyle w:val="Normal"/>
               <w:jc w:val="center"/>
               <w:pBdr>
                 <w:bottom w:val="none" w:sz="0" w:space="0" w:color="000000"/>
@@ -3912,7 +3851,6 @@
           </w:tcPr>
           <w:p>
             <w:pPr>
-              <w:pStyle w:val="Normal"/>
               <w:jc w:val="center"/>
               <w:pBdr>
                 <w:bottom w:val="none" w:sz="0" w:space="0" w:color="000000"/>
@@ -3967,7 +3905,6 @@
           </w:tcPr>
           <w:p>
             <w:pPr>
-              <w:pStyle w:val="Normal"/>
               <w:jc w:val="center"/>
               <w:pBdr>
                 <w:bottom w:val="none" w:sz="0" w:space="0" w:color="000000"/>
@@ -4022,7 +3959,6 @@
           </w:tcPr>
           <w:p>
             <w:pPr>
-              <w:pStyle w:val="Normal"/>
               <w:jc w:val="center"/>
               <w:pBdr>
                 <w:bottom w:val="none" w:sz="0" w:space="0" w:color="000000"/>
@@ -4063,6 +3999,7 @@
         <w:trPr>
           <w:trHeight w:val="360" w:hRule="auto"/>
         </w:trPr>
+        body8
         <w:tc>
           <w:tcPr>
             <w:tcBorders>
@@ -4082,7 +4019,6 @@
           </w:tcPr>
           <w:p>
             <w:pPr>
-              <w:pStyle w:val="Normal"/>
               <w:jc w:val="left"/>
               <w:pBdr>
                 <w:bottom w:val="none" w:sz="0" w:space="0" w:color="000000"/>
@@ -4137,7 +4073,6 @@
           </w:tcPr>
           <w:p>
             <w:pPr>
-              <w:pStyle w:val="Normal"/>
               <w:jc w:val="center"/>
               <w:pBdr>
                 <w:bottom w:val="none" w:sz="0" w:space="0" w:color="000000"/>
@@ -4192,7 +4127,6 @@
           </w:tcPr>
           <w:p>
             <w:pPr>
-              <w:pStyle w:val="Normal"/>
               <w:jc w:val="center"/>
               <w:pBdr>
                 <w:bottom w:val="none" w:sz="0" w:space="0" w:color="000000"/>
@@ -4247,7 +4181,6 @@
           </w:tcPr>
           <w:p>
             <w:pPr>
-              <w:pStyle w:val="Normal"/>
               <w:jc w:val="center"/>
               <w:pBdr>
                 <w:bottom w:val="none" w:sz="0" w:space="0" w:color="000000"/>
@@ -4302,7 +4235,6 @@
           </w:tcPr>
           <w:p>
             <w:pPr>
-              <w:pStyle w:val="Normal"/>
               <w:jc w:val="center"/>
               <w:pBdr>
                 <w:bottom w:val="none" w:sz="0" w:space="0" w:color="000000"/>
@@ -4357,7 +4289,6 @@
           </w:tcPr>
           <w:p>
             <w:pPr>
-              <w:pStyle w:val="Normal"/>
               <w:jc w:val="center"/>
               <w:pBdr>
                 <w:bottom w:val="none" w:sz="0" w:space="0" w:color="000000"/>
@@ -4412,7 +4343,6 @@
           </w:tcPr>
           <w:p>
             <w:pPr>
-              <w:pStyle w:val="Normal"/>
               <w:jc w:val="center"/>
               <w:pBdr>
                 <w:bottom w:val="none" w:sz="0" w:space="0" w:color="000000"/>
@@ -4467,7 +4397,6 @@
           </w:tcPr>
           <w:p>
             <w:pPr>
-              <w:pStyle w:val="Normal"/>
               <w:jc w:val="center"/>
               <w:pBdr>
                 <w:bottom w:val="none" w:sz="0" w:space="0" w:color="000000"/>
@@ -4522,7 +4451,6 @@
           </w:tcPr>
           <w:p>
             <w:pPr>
-              <w:pStyle w:val="Normal"/>
               <w:jc w:val="center"/>
               <w:pBdr>
                 <w:bottom w:val="none" w:sz="0" w:space="0" w:color="000000"/>

</xml_diff>

<commit_message>
making sure my file runs
</commit_message>
<xml_diff>
--- a/Output/Ria_correlation_matrix.docx
+++ b/Output/Ria_correlation_matrix.docx
@@ -63,7 +63,6 @@
           <w:trHeight w:val="360" w:hRule="auto"/>
           <w:tblHeader/>
         </w:trPr>
-        header1
         <w:tc>
           <w:tcPr>
             <w:tcBorders>
@@ -83,6 +82,7 @@
           </w:tcPr>
           <w:p>
             <w:pPr>
+              <w:pStyle w:val="Normal"/>
               <w:jc w:val="left"/>
               <w:pBdr>
                 <w:bottom w:val="none" w:sz="0" w:space="0" w:color="000000"/>
@@ -137,6 +137,7 @@
           </w:tcPr>
           <w:p>
             <w:pPr>
+              <w:pStyle w:val="Normal"/>
               <w:jc w:val="center"/>
               <w:pBdr>
                 <w:bottom w:val="none" w:sz="0" w:space="0" w:color="000000"/>
@@ -191,6 +192,7 @@
           </w:tcPr>
           <w:p>
             <w:pPr>
+              <w:pStyle w:val="Normal"/>
               <w:jc w:val="center"/>
               <w:pBdr>
                 <w:bottom w:val="none" w:sz="0" w:space="0" w:color="000000"/>
@@ -245,6 +247,7 @@
           </w:tcPr>
           <w:p>
             <w:pPr>
+              <w:pStyle w:val="Normal"/>
               <w:jc w:val="center"/>
               <w:pBdr>
                 <w:bottom w:val="none" w:sz="0" w:space="0" w:color="000000"/>
@@ -299,6 +302,7 @@
           </w:tcPr>
           <w:p>
             <w:pPr>
+              <w:pStyle w:val="Normal"/>
               <w:jc w:val="center"/>
               <w:pBdr>
                 <w:bottom w:val="none" w:sz="0" w:space="0" w:color="000000"/>
@@ -353,6 +357,7 @@
           </w:tcPr>
           <w:p>
             <w:pPr>
+              <w:pStyle w:val="Normal"/>
               <w:jc w:val="center"/>
               <w:pBdr>
                 <w:bottom w:val="none" w:sz="0" w:space="0" w:color="000000"/>
@@ -407,6 +412,7 @@
           </w:tcPr>
           <w:p>
             <w:pPr>
+              <w:pStyle w:val="Normal"/>
               <w:jc w:val="center"/>
               <w:pBdr>
                 <w:bottom w:val="none" w:sz="0" w:space="0" w:color="000000"/>
@@ -461,6 +467,7 @@
           </w:tcPr>
           <w:p>
             <w:pPr>
+              <w:pStyle w:val="Normal"/>
               <w:jc w:val="center"/>
               <w:pBdr>
                 <w:bottom w:val="none" w:sz="0" w:space="0" w:color="000000"/>
@@ -515,6 +522,7 @@
           </w:tcPr>
           <w:p>
             <w:pPr>
+              <w:pStyle w:val="Normal"/>
               <w:jc w:val="center"/>
               <w:pBdr>
                 <w:bottom w:val="none" w:sz="0" w:space="0" w:color="000000"/>
@@ -555,7 +563,6 @@
         <w:trPr>
           <w:trHeight w:val="360" w:hRule="auto"/>
         </w:trPr>
-        body1
         <w:tc>
           <w:tcPr>
             <w:tcBorders>
@@ -575,6 +582,7 @@
           </w:tcPr>
           <w:p>
             <w:pPr>
+              <w:pStyle w:val="Normal"/>
               <w:jc w:val="left"/>
               <w:pBdr>
                 <w:bottom w:val="none" w:sz="0" w:space="0" w:color="000000"/>
@@ -629,6 +637,7 @@
           </w:tcPr>
           <w:p>
             <w:pPr>
+              <w:pStyle w:val="Normal"/>
               <w:jc w:val="center"/>
               <w:pBdr>
                 <w:bottom w:val="none" w:sz="0" w:space="0" w:color="000000"/>
@@ -683,6 +692,7 @@
           </w:tcPr>
           <w:p>
             <w:pPr>
+              <w:pStyle w:val="Normal"/>
               <w:jc w:val="center"/>
               <w:pBdr>
                 <w:bottom w:val="none" w:sz="0" w:space="0" w:color="000000"/>
@@ -737,6 +747,7 @@
           </w:tcPr>
           <w:p>
             <w:pPr>
+              <w:pStyle w:val="Normal"/>
               <w:jc w:val="center"/>
               <w:pBdr>
                 <w:bottom w:val="none" w:sz="0" w:space="0" w:color="000000"/>
@@ -791,6 +802,7 @@
           </w:tcPr>
           <w:p>
             <w:pPr>
+              <w:pStyle w:val="Normal"/>
               <w:jc w:val="center"/>
               <w:pBdr>
                 <w:bottom w:val="none" w:sz="0" w:space="0" w:color="000000"/>
@@ -845,6 +857,7 @@
           </w:tcPr>
           <w:p>
             <w:pPr>
+              <w:pStyle w:val="Normal"/>
               <w:jc w:val="center"/>
               <w:pBdr>
                 <w:bottom w:val="none" w:sz="0" w:space="0" w:color="000000"/>
@@ -899,6 +912,7 @@
           </w:tcPr>
           <w:p>
             <w:pPr>
+              <w:pStyle w:val="Normal"/>
               <w:jc w:val="center"/>
               <w:pBdr>
                 <w:bottom w:val="none" w:sz="0" w:space="0" w:color="000000"/>
@@ -953,6 +967,7 @@
           </w:tcPr>
           <w:p>
             <w:pPr>
+              <w:pStyle w:val="Normal"/>
               <w:jc w:val="center"/>
               <w:pBdr>
                 <w:bottom w:val="none" w:sz="0" w:space="0" w:color="000000"/>
@@ -1007,6 +1022,7 @@
           </w:tcPr>
           <w:p>
             <w:pPr>
+              <w:pStyle w:val="Normal"/>
               <w:jc w:val="center"/>
               <w:pBdr>
                 <w:bottom w:val="none" w:sz="0" w:space="0" w:color="000000"/>
@@ -1047,26 +1063,26 @@
         <w:trPr>
           <w:trHeight w:val="360" w:hRule="auto"/>
         </w:trPr>
-        body2
-        <w:tc>
-          <w:tcPr>
-            <w:tcBorders>
-              <w:bottom w:val="none" w:sz="0" w:space="0" w:color="000000"/>
-              <w:top w:val="none" w:sz="0" w:space="0" w:color="000000"/>
-              <w:left w:val="none" w:sz="0" w:space="0" w:color="000000"/>
-              <w:right w:val="none" w:sz="0" w:space="0" w:color="000000"/>
-            </w:tcBorders>
-            <w:shd w:val="clear" w:color="auto" w:fill="FFFFFF"/>
-            <w:tcMar>
-              <w:top w:w="0" w:type="dxa"/>
-              <w:bottom w:w="0" w:type="dxa"/>
-              <w:left w:w="0" w:type="dxa"/>
-              <w:right w:w="0" w:type="dxa"/>
-            </w:tcMar>
-            <w:vAlign w:val="center"/>
-          </w:tcPr>
-          <w:p>
-            <w:pPr>
+        <w:tc>
+          <w:tcPr>
+            <w:tcBorders>
+              <w:bottom w:val="none" w:sz="0" w:space="0" w:color="000000"/>
+              <w:top w:val="none" w:sz="0" w:space="0" w:color="000000"/>
+              <w:left w:val="none" w:sz="0" w:space="0" w:color="000000"/>
+              <w:right w:val="none" w:sz="0" w:space="0" w:color="000000"/>
+            </w:tcBorders>
+            <w:shd w:val="clear" w:color="auto" w:fill="FFFFFF"/>
+            <w:tcMar>
+              <w:top w:w="0" w:type="dxa"/>
+              <w:bottom w:w="0" w:type="dxa"/>
+              <w:left w:w="0" w:type="dxa"/>
+              <w:right w:w="0" w:type="dxa"/>
+            </w:tcMar>
+            <w:vAlign w:val="center"/>
+          </w:tcPr>
+          <w:p>
+            <w:pPr>
+              <w:pStyle w:val="Normal"/>
               <w:jc w:val="left"/>
               <w:pBdr>
                 <w:bottom w:val="none" w:sz="0" w:space="0" w:color="000000"/>
@@ -1121,6 +1137,7 @@
           </w:tcPr>
           <w:p>
             <w:pPr>
+              <w:pStyle w:val="Normal"/>
               <w:jc w:val="center"/>
               <w:pBdr>
                 <w:bottom w:val="none" w:sz="0" w:space="0" w:color="000000"/>
@@ -1175,6 +1192,7 @@
           </w:tcPr>
           <w:p>
             <w:pPr>
+              <w:pStyle w:val="Normal"/>
               <w:jc w:val="center"/>
               <w:pBdr>
                 <w:bottom w:val="none" w:sz="0" w:space="0" w:color="000000"/>
@@ -1229,6 +1247,7 @@
           </w:tcPr>
           <w:p>
             <w:pPr>
+              <w:pStyle w:val="Normal"/>
               <w:jc w:val="center"/>
               <w:pBdr>
                 <w:bottom w:val="none" w:sz="0" w:space="0" w:color="000000"/>
@@ -1283,6 +1302,7 @@
           </w:tcPr>
           <w:p>
             <w:pPr>
+              <w:pStyle w:val="Normal"/>
               <w:jc w:val="center"/>
               <w:pBdr>
                 <w:bottom w:val="none" w:sz="0" w:space="0" w:color="000000"/>
@@ -1337,6 +1357,7 @@
           </w:tcPr>
           <w:p>
             <w:pPr>
+              <w:pStyle w:val="Normal"/>
               <w:jc w:val="center"/>
               <w:pBdr>
                 <w:bottom w:val="none" w:sz="0" w:space="0" w:color="000000"/>
@@ -1391,6 +1412,7 @@
           </w:tcPr>
           <w:p>
             <w:pPr>
+              <w:pStyle w:val="Normal"/>
               <w:jc w:val="center"/>
               <w:pBdr>
                 <w:bottom w:val="none" w:sz="0" w:space="0" w:color="000000"/>
@@ -1445,6 +1467,7 @@
           </w:tcPr>
           <w:p>
             <w:pPr>
+              <w:pStyle w:val="Normal"/>
               <w:jc w:val="center"/>
               <w:pBdr>
                 <w:bottom w:val="none" w:sz="0" w:space="0" w:color="000000"/>
@@ -1499,6 +1522,7 @@
           </w:tcPr>
           <w:p>
             <w:pPr>
+              <w:pStyle w:val="Normal"/>
               <w:jc w:val="center"/>
               <w:pBdr>
                 <w:bottom w:val="none" w:sz="0" w:space="0" w:color="000000"/>
@@ -1539,26 +1563,26 @@
         <w:trPr>
           <w:trHeight w:val="360" w:hRule="auto"/>
         </w:trPr>
-        body3
-        <w:tc>
-          <w:tcPr>
-            <w:tcBorders>
-              <w:bottom w:val="none" w:sz="0" w:space="0" w:color="000000"/>
-              <w:top w:val="none" w:sz="0" w:space="0" w:color="000000"/>
-              <w:left w:val="none" w:sz="0" w:space="0" w:color="000000"/>
-              <w:right w:val="none" w:sz="0" w:space="0" w:color="000000"/>
-            </w:tcBorders>
-            <w:shd w:val="clear" w:color="auto" w:fill="FFFFFF"/>
-            <w:tcMar>
-              <w:top w:w="0" w:type="dxa"/>
-              <w:bottom w:w="0" w:type="dxa"/>
-              <w:left w:w="0" w:type="dxa"/>
-              <w:right w:w="0" w:type="dxa"/>
-            </w:tcMar>
-            <w:vAlign w:val="center"/>
-          </w:tcPr>
-          <w:p>
-            <w:pPr>
+        <w:tc>
+          <w:tcPr>
+            <w:tcBorders>
+              <w:bottom w:val="none" w:sz="0" w:space="0" w:color="000000"/>
+              <w:top w:val="none" w:sz="0" w:space="0" w:color="000000"/>
+              <w:left w:val="none" w:sz="0" w:space="0" w:color="000000"/>
+              <w:right w:val="none" w:sz="0" w:space="0" w:color="000000"/>
+            </w:tcBorders>
+            <w:shd w:val="clear" w:color="auto" w:fill="FFFFFF"/>
+            <w:tcMar>
+              <w:top w:w="0" w:type="dxa"/>
+              <w:bottom w:w="0" w:type="dxa"/>
+              <w:left w:w="0" w:type="dxa"/>
+              <w:right w:w="0" w:type="dxa"/>
+            </w:tcMar>
+            <w:vAlign w:val="center"/>
+          </w:tcPr>
+          <w:p>
+            <w:pPr>
+              <w:pStyle w:val="Normal"/>
               <w:jc w:val="left"/>
               <w:pBdr>
                 <w:bottom w:val="none" w:sz="0" w:space="0" w:color="000000"/>
@@ -1613,6 +1637,7 @@
           </w:tcPr>
           <w:p>
             <w:pPr>
+              <w:pStyle w:val="Normal"/>
               <w:jc w:val="center"/>
               <w:pBdr>
                 <w:bottom w:val="none" w:sz="0" w:space="0" w:color="000000"/>
@@ -1667,6 +1692,7 @@
           </w:tcPr>
           <w:p>
             <w:pPr>
+              <w:pStyle w:val="Normal"/>
               <w:jc w:val="center"/>
               <w:pBdr>
                 <w:bottom w:val="none" w:sz="0" w:space="0" w:color="000000"/>
@@ -1721,6 +1747,7 @@
           </w:tcPr>
           <w:p>
             <w:pPr>
+              <w:pStyle w:val="Normal"/>
               <w:jc w:val="center"/>
               <w:pBdr>
                 <w:bottom w:val="none" w:sz="0" w:space="0" w:color="000000"/>
@@ -1775,6 +1802,7 @@
           </w:tcPr>
           <w:p>
             <w:pPr>
+              <w:pStyle w:val="Normal"/>
               <w:jc w:val="center"/>
               <w:pBdr>
                 <w:bottom w:val="none" w:sz="0" w:space="0" w:color="000000"/>
@@ -1829,6 +1857,7 @@
           </w:tcPr>
           <w:p>
             <w:pPr>
+              <w:pStyle w:val="Normal"/>
               <w:jc w:val="center"/>
               <w:pBdr>
                 <w:bottom w:val="none" w:sz="0" w:space="0" w:color="000000"/>
@@ -1883,6 +1912,7 @@
           </w:tcPr>
           <w:p>
             <w:pPr>
+              <w:pStyle w:val="Normal"/>
               <w:jc w:val="center"/>
               <w:pBdr>
                 <w:bottom w:val="none" w:sz="0" w:space="0" w:color="000000"/>
@@ -1937,6 +1967,7 @@
           </w:tcPr>
           <w:p>
             <w:pPr>
+              <w:pStyle w:val="Normal"/>
               <w:jc w:val="center"/>
               <w:pBdr>
                 <w:bottom w:val="none" w:sz="0" w:space="0" w:color="000000"/>
@@ -1991,6 +2022,7 @@
           </w:tcPr>
           <w:p>
             <w:pPr>
+              <w:pStyle w:val="Normal"/>
               <w:jc w:val="center"/>
               <w:pBdr>
                 <w:bottom w:val="none" w:sz="0" w:space="0" w:color="000000"/>
@@ -2031,26 +2063,26 @@
         <w:trPr>
           <w:trHeight w:val="360" w:hRule="auto"/>
         </w:trPr>
-        body4
-        <w:tc>
-          <w:tcPr>
-            <w:tcBorders>
-              <w:bottom w:val="none" w:sz="0" w:space="0" w:color="000000"/>
-              <w:top w:val="none" w:sz="0" w:space="0" w:color="000000"/>
-              <w:left w:val="none" w:sz="0" w:space="0" w:color="000000"/>
-              <w:right w:val="none" w:sz="0" w:space="0" w:color="000000"/>
-            </w:tcBorders>
-            <w:shd w:val="clear" w:color="auto" w:fill="FFFFFF"/>
-            <w:tcMar>
-              <w:top w:w="0" w:type="dxa"/>
-              <w:bottom w:w="0" w:type="dxa"/>
-              <w:left w:w="0" w:type="dxa"/>
-              <w:right w:w="0" w:type="dxa"/>
-            </w:tcMar>
-            <w:vAlign w:val="center"/>
-          </w:tcPr>
-          <w:p>
-            <w:pPr>
+        <w:tc>
+          <w:tcPr>
+            <w:tcBorders>
+              <w:bottom w:val="none" w:sz="0" w:space="0" w:color="000000"/>
+              <w:top w:val="none" w:sz="0" w:space="0" w:color="000000"/>
+              <w:left w:val="none" w:sz="0" w:space="0" w:color="000000"/>
+              <w:right w:val="none" w:sz="0" w:space="0" w:color="000000"/>
+            </w:tcBorders>
+            <w:shd w:val="clear" w:color="auto" w:fill="FFFFFF"/>
+            <w:tcMar>
+              <w:top w:w="0" w:type="dxa"/>
+              <w:bottom w:w="0" w:type="dxa"/>
+              <w:left w:w="0" w:type="dxa"/>
+              <w:right w:w="0" w:type="dxa"/>
+            </w:tcMar>
+            <w:vAlign w:val="center"/>
+          </w:tcPr>
+          <w:p>
+            <w:pPr>
+              <w:pStyle w:val="Normal"/>
               <w:jc w:val="left"/>
               <w:pBdr>
                 <w:bottom w:val="none" w:sz="0" w:space="0" w:color="000000"/>
@@ -2105,6 +2137,7 @@
           </w:tcPr>
           <w:p>
             <w:pPr>
+              <w:pStyle w:val="Normal"/>
               <w:jc w:val="center"/>
               <w:pBdr>
                 <w:bottom w:val="none" w:sz="0" w:space="0" w:color="000000"/>
@@ -2159,6 +2192,7 @@
           </w:tcPr>
           <w:p>
             <w:pPr>
+              <w:pStyle w:val="Normal"/>
               <w:jc w:val="center"/>
               <w:pBdr>
                 <w:bottom w:val="none" w:sz="0" w:space="0" w:color="000000"/>
@@ -2213,6 +2247,7 @@
           </w:tcPr>
           <w:p>
             <w:pPr>
+              <w:pStyle w:val="Normal"/>
               <w:jc w:val="center"/>
               <w:pBdr>
                 <w:bottom w:val="none" w:sz="0" w:space="0" w:color="000000"/>
@@ -2267,6 +2302,7 @@
           </w:tcPr>
           <w:p>
             <w:pPr>
+              <w:pStyle w:val="Normal"/>
               <w:jc w:val="center"/>
               <w:pBdr>
                 <w:bottom w:val="none" w:sz="0" w:space="0" w:color="000000"/>
@@ -2321,6 +2357,7 @@
           </w:tcPr>
           <w:p>
             <w:pPr>
+              <w:pStyle w:val="Normal"/>
               <w:jc w:val="center"/>
               <w:pBdr>
                 <w:bottom w:val="none" w:sz="0" w:space="0" w:color="000000"/>
@@ -2375,6 +2412,7 @@
           </w:tcPr>
           <w:p>
             <w:pPr>
+              <w:pStyle w:val="Normal"/>
               <w:jc w:val="center"/>
               <w:pBdr>
                 <w:bottom w:val="none" w:sz="0" w:space="0" w:color="000000"/>
@@ -2429,6 +2467,7 @@
           </w:tcPr>
           <w:p>
             <w:pPr>
+              <w:pStyle w:val="Normal"/>
               <w:jc w:val="center"/>
               <w:pBdr>
                 <w:bottom w:val="none" w:sz="0" w:space="0" w:color="000000"/>
@@ -2483,6 +2522,7 @@
           </w:tcPr>
           <w:p>
             <w:pPr>
+              <w:pStyle w:val="Normal"/>
               <w:jc w:val="center"/>
               <w:pBdr>
                 <w:bottom w:val="none" w:sz="0" w:space="0" w:color="000000"/>
@@ -2523,26 +2563,26 @@
         <w:trPr>
           <w:trHeight w:val="360" w:hRule="auto"/>
         </w:trPr>
-        body5
-        <w:tc>
-          <w:tcPr>
-            <w:tcBorders>
-              <w:bottom w:val="none" w:sz="0" w:space="0" w:color="000000"/>
-              <w:top w:val="none" w:sz="0" w:space="0" w:color="000000"/>
-              <w:left w:val="none" w:sz="0" w:space="0" w:color="000000"/>
-              <w:right w:val="none" w:sz="0" w:space="0" w:color="000000"/>
-            </w:tcBorders>
-            <w:shd w:val="clear" w:color="auto" w:fill="FFFFFF"/>
-            <w:tcMar>
-              <w:top w:w="0" w:type="dxa"/>
-              <w:bottom w:w="0" w:type="dxa"/>
-              <w:left w:w="0" w:type="dxa"/>
-              <w:right w:w="0" w:type="dxa"/>
-            </w:tcMar>
-            <w:vAlign w:val="center"/>
-          </w:tcPr>
-          <w:p>
-            <w:pPr>
+        <w:tc>
+          <w:tcPr>
+            <w:tcBorders>
+              <w:bottom w:val="none" w:sz="0" w:space="0" w:color="000000"/>
+              <w:top w:val="none" w:sz="0" w:space="0" w:color="000000"/>
+              <w:left w:val="none" w:sz="0" w:space="0" w:color="000000"/>
+              <w:right w:val="none" w:sz="0" w:space="0" w:color="000000"/>
+            </w:tcBorders>
+            <w:shd w:val="clear" w:color="auto" w:fill="FFFFFF"/>
+            <w:tcMar>
+              <w:top w:w="0" w:type="dxa"/>
+              <w:bottom w:w="0" w:type="dxa"/>
+              <w:left w:w="0" w:type="dxa"/>
+              <w:right w:w="0" w:type="dxa"/>
+            </w:tcMar>
+            <w:vAlign w:val="center"/>
+          </w:tcPr>
+          <w:p>
+            <w:pPr>
+              <w:pStyle w:val="Normal"/>
               <w:jc w:val="left"/>
               <w:pBdr>
                 <w:bottom w:val="none" w:sz="0" w:space="0" w:color="000000"/>
@@ -2597,6 +2637,7 @@
           </w:tcPr>
           <w:p>
             <w:pPr>
+              <w:pStyle w:val="Normal"/>
               <w:jc w:val="center"/>
               <w:pBdr>
                 <w:bottom w:val="none" w:sz="0" w:space="0" w:color="000000"/>
@@ -2651,6 +2692,7 @@
           </w:tcPr>
           <w:p>
             <w:pPr>
+              <w:pStyle w:val="Normal"/>
               <w:jc w:val="center"/>
               <w:pBdr>
                 <w:bottom w:val="none" w:sz="0" w:space="0" w:color="000000"/>
@@ -2705,6 +2747,7 @@
           </w:tcPr>
           <w:p>
             <w:pPr>
+              <w:pStyle w:val="Normal"/>
               <w:jc w:val="center"/>
               <w:pBdr>
                 <w:bottom w:val="none" w:sz="0" w:space="0" w:color="000000"/>
@@ -2759,6 +2802,7 @@
           </w:tcPr>
           <w:p>
             <w:pPr>
+              <w:pStyle w:val="Normal"/>
               <w:jc w:val="center"/>
               <w:pBdr>
                 <w:bottom w:val="none" w:sz="0" w:space="0" w:color="000000"/>
@@ -2813,6 +2857,7 @@
           </w:tcPr>
           <w:p>
             <w:pPr>
+              <w:pStyle w:val="Normal"/>
               <w:jc w:val="center"/>
               <w:pBdr>
                 <w:bottom w:val="none" w:sz="0" w:space="0" w:color="000000"/>
@@ -2867,6 +2912,7 @@
           </w:tcPr>
           <w:p>
             <w:pPr>
+              <w:pStyle w:val="Normal"/>
               <w:jc w:val="center"/>
               <w:pBdr>
                 <w:bottom w:val="none" w:sz="0" w:space="0" w:color="000000"/>
@@ -2921,6 +2967,7 @@
           </w:tcPr>
           <w:p>
             <w:pPr>
+              <w:pStyle w:val="Normal"/>
               <w:jc w:val="center"/>
               <w:pBdr>
                 <w:bottom w:val="none" w:sz="0" w:space="0" w:color="000000"/>
@@ -2975,6 +3022,7 @@
           </w:tcPr>
           <w:p>
             <w:pPr>
+              <w:pStyle w:val="Normal"/>
               <w:jc w:val="center"/>
               <w:pBdr>
                 <w:bottom w:val="none" w:sz="0" w:space="0" w:color="000000"/>
@@ -3015,26 +3063,26 @@
         <w:trPr>
           <w:trHeight w:val="360" w:hRule="auto"/>
         </w:trPr>
-        body6
-        <w:tc>
-          <w:tcPr>
-            <w:tcBorders>
-              <w:bottom w:val="none" w:sz="0" w:space="0" w:color="000000"/>
-              <w:top w:val="none" w:sz="0" w:space="0" w:color="000000"/>
-              <w:left w:val="none" w:sz="0" w:space="0" w:color="000000"/>
-              <w:right w:val="none" w:sz="0" w:space="0" w:color="000000"/>
-            </w:tcBorders>
-            <w:shd w:val="clear" w:color="auto" w:fill="FFFFFF"/>
-            <w:tcMar>
-              <w:top w:w="0" w:type="dxa"/>
-              <w:bottom w:w="0" w:type="dxa"/>
-              <w:left w:w="0" w:type="dxa"/>
-              <w:right w:w="0" w:type="dxa"/>
-            </w:tcMar>
-            <w:vAlign w:val="center"/>
-          </w:tcPr>
-          <w:p>
-            <w:pPr>
+        <w:tc>
+          <w:tcPr>
+            <w:tcBorders>
+              <w:bottom w:val="none" w:sz="0" w:space="0" w:color="000000"/>
+              <w:top w:val="none" w:sz="0" w:space="0" w:color="000000"/>
+              <w:left w:val="none" w:sz="0" w:space="0" w:color="000000"/>
+              <w:right w:val="none" w:sz="0" w:space="0" w:color="000000"/>
+            </w:tcBorders>
+            <w:shd w:val="clear" w:color="auto" w:fill="FFFFFF"/>
+            <w:tcMar>
+              <w:top w:w="0" w:type="dxa"/>
+              <w:bottom w:w="0" w:type="dxa"/>
+              <w:left w:w="0" w:type="dxa"/>
+              <w:right w:w="0" w:type="dxa"/>
+            </w:tcMar>
+            <w:vAlign w:val="center"/>
+          </w:tcPr>
+          <w:p>
+            <w:pPr>
+              <w:pStyle w:val="Normal"/>
               <w:jc w:val="left"/>
               <w:pBdr>
                 <w:bottom w:val="none" w:sz="0" w:space="0" w:color="000000"/>
@@ -3089,6 +3137,7 @@
           </w:tcPr>
           <w:p>
             <w:pPr>
+              <w:pStyle w:val="Normal"/>
               <w:jc w:val="center"/>
               <w:pBdr>
                 <w:bottom w:val="none" w:sz="0" w:space="0" w:color="000000"/>
@@ -3143,6 +3192,7 @@
           </w:tcPr>
           <w:p>
             <w:pPr>
+              <w:pStyle w:val="Normal"/>
               <w:jc w:val="center"/>
               <w:pBdr>
                 <w:bottom w:val="none" w:sz="0" w:space="0" w:color="000000"/>
@@ -3197,6 +3247,7 @@
           </w:tcPr>
           <w:p>
             <w:pPr>
+              <w:pStyle w:val="Normal"/>
               <w:jc w:val="center"/>
               <w:pBdr>
                 <w:bottom w:val="none" w:sz="0" w:space="0" w:color="000000"/>
@@ -3251,6 +3302,7 @@
           </w:tcPr>
           <w:p>
             <w:pPr>
+              <w:pStyle w:val="Normal"/>
               <w:jc w:val="center"/>
               <w:pBdr>
                 <w:bottom w:val="none" w:sz="0" w:space="0" w:color="000000"/>
@@ -3305,6 +3357,7 @@
           </w:tcPr>
           <w:p>
             <w:pPr>
+              <w:pStyle w:val="Normal"/>
               <w:jc w:val="center"/>
               <w:pBdr>
                 <w:bottom w:val="none" w:sz="0" w:space="0" w:color="000000"/>
@@ -3359,6 +3412,7 @@
           </w:tcPr>
           <w:p>
             <w:pPr>
+              <w:pStyle w:val="Normal"/>
               <w:jc w:val="center"/>
               <w:pBdr>
                 <w:bottom w:val="none" w:sz="0" w:space="0" w:color="000000"/>
@@ -3413,6 +3467,7 @@
           </w:tcPr>
           <w:p>
             <w:pPr>
+              <w:pStyle w:val="Normal"/>
               <w:jc w:val="center"/>
               <w:pBdr>
                 <w:bottom w:val="none" w:sz="0" w:space="0" w:color="000000"/>
@@ -3467,6 +3522,7 @@
           </w:tcPr>
           <w:p>
             <w:pPr>
+              <w:pStyle w:val="Normal"/>
               <w:jc w:val="center"/>
               <w:pBdr>
                 <w:bottom w:val="none" w:sz="0" w:space="0" w:color="000000"/>
@@ -3507,26 +3563,26 @@
         <w:trPr>
           <w:trHeight w:val="360" w:hRule="auto"/>
         </w:trPr>
-        body7
-        <w:tc>
-          <w:tcPr>
-            <w:tcBorders>
-              <w:bottom w:val="none" w:sz="0" w:space="0" w:color="000000"/>
-              <w:top w:val="none" w:sz="0" w:space="0" w:color="000000"/>
-              <w:left w:val="none" w:sz="0" w:space="0" w:color="000000"/>
-              <w:right w:val="none" w:sz="0" w:space="0" w:color="000000"/>
-            </w:tcBorders>
-            <w:shd w:val="clear" w:color="auto" w:fill="FFFFFF"/>
-            <w:tcMar>
-              <w:top w:w="0" w:type="dxa"/>
-              <w:bottom w:w="0" w:type="dxa"/>
-              <w:left w:w="0" w:type="dxa"/>
-              <w:right w:w="0" w:type="dxa"/>
-            </w:tcMar>
-            <w:vAlign w:val="center"/>
-          </w:tcPr>
-          <w:p>
-            <w:pPr>
+        <w:tc>
+          <w:tcPr>
+            <w:tcBorders>
+              <w:bottom w:val="none" w:sz="0" w:space="0" w:color="000000"/>
+              <w:top w:val="none" w:sz="0" w:space="0" w:color="000000"/>
+              <w:left w:val="none" w:sz="0" w:space="0" w:color="000000"/>
+              <w:right w:val="none" w:sz="0" w:space="0" w:color="000000"/>
+            </w:tcBorders>
+            <w:shd w:val="clear" w:color="auto" w:fill="FFFFFF"/>
+            <w:tcMar>
+              <w:top w:w="0" w:type="dxa"/>
+              <w:bottom w:w="0" w:type="dxa"/>
+              <w:left w:w="0" w:type="dxa"/>
+              <w:right w:w="0" w:type="dxa"/>
+            </w:tcMar>
+            <w:vAlign w:val="center"/>
+          </w:tcPr>
+          <w:p>
+            <w:pPr>
+              <w:pStyle w:val="Normal"/>
               <w:jc w:val="left"/>
               <w:pBdr>
                 <w:bottom w:val="none" w:sz="0" w:space="0" w:color="000000"/>
@@ -3581,6 +3637,7 @@
           </w:tcPr>
           <w:p>
             <w:pPr>
+              <w:pStyle w:val="Normal"/>
               <w:jc w:val="center"/>
               <w:pBdr>
                 <w:bottom w:val="none" w:sz="0" w:space="0" w:color="000000"/>
@@ -3635,6 +3692,7 @@
           </w:tcPr>
           <w:p>
             <w:pPr>
+              <w:pStyle w:val="Normal"/>
               <w:jc w:val="center"/>
               <w:pBdr>
                 <w:bottom w:val="none" w:sz="0" w:space="0" w:color="000000"/>
@@ -3689,6 +3747,7 @@
           </w:tcPr>
           <w:p>
             <w:pPr>
+              <w:pStyle w:val="Normal"/>
               <w:jc w:val="center"/>
               <w:pBdr>
                 <w:bottom w:val="none" w:sz="0" w:space="0" w:color="000000"/>
@@ -3743,6 +3802,7 @@
           </w:tcPr>
           <w:p>
             <w:pPr>
+              <w:pStyle w:val="Normal"/>
               <w:jc w:val="center"/>
               <w:pBdr>
                 <w:bottom w:val="none" w:sz="0" w:space="0" w:color="000000"/>
@@ -3797,6 +3857,7 @@
           </w:tcPr>
           <w:p>
             <w:pPr>
+              <w:pStyle w:val="Normal"/>
               <w:jc w:val="center"/>
               <w:pBdr>
                 <w:bottom w:val="none" w:sz="0" w:space="0" w:color="000000"/>
@@ -3851,6 +3912,7 @@
           </w:tcPr>
           <w:p>
             <w:pPr>
+              <w:pStyle w:val="Normal"/>
               <w:jc w:val="center"/>
               <w:pBdr>
                 <w:bottom w:val="none" w:sz="0" w:space="0" w:color="000000"/>
@@ -3905,6 +3967,7 @@
           </w:tcPr>
           <w:p>
             <w:pPr>
+              <w:pStyle w:val="Normal"/>
               <w:jc w:val="center"/>
               <w:pBdr>
                 <w:bottom w:val="none" w:sz="0" w:space="0" w:color="000000"/>
@@ -3959,6 +4022,7 @@
           </w:tcPr>
           <w:p>
             <w:pPr>
+              <w:pStyle w:val="Normal"/>
               <w:jc w:val="center"/>
               <w:pBdr>
                 <w:bottom w:val="none" w:sz="0" w:space="0" w:color="000000"/>
@@ -3999,7 +4063,6 @@
         <w:trPr>
           <w:trHeight w:val="360" w:hRule="auto"/>
         </w:trPr>
-        body8
         <w:tc>
           <w:tcPr>
             <w:tcBorders>
@@ -4019,6 +4082,7 @@
           </w:tcPr>
           <w:p>
             <w:pPr>
+              <w:pStyle w:val="Normal"/>
               <w:jc w:val="left"/>
               <w:pBdr>
                 <w:bottom w:val="none" w:sz="0" w:space="0" w:color="000000"/>
@@ -4073,6 +4137,7 @@
           </w:tcPr>
           <w:p>
             <w:pPr>
+              <w:pStyle w:val="Normal"/>
               <w:jc w:val="center"/>
               <w:pBdr>
                 <w:bottom w:val="none" w:sz="0" w:space="0" w:color="000000"/>
@@ -4127,6 +4192,7 @@
           </w:tcPr>
           <w:p>
             <w:pPr>
+              <w:pStyle w:val="Normal"/>
               <w:jc w:val="center"/>
               <w:pBdr>
                 <w:bottom w:val="none" w:sz="0" w:space="0" w:color="000000"/>
@@ -4181,6 +4247,7 @@
           </w:tcPr>
           <w:p>
             <w:pPr>
+              <w:pStyle w:val="Normal"/>
               <w:jc w:val="center"/>
               <w:pBdr>
                 <w:bottom w:val="none" w:sz="0" w:space="0" w:color="000000"/>
@@ -4235,6 +4302,7 @@
           </w:tcPr>
           <w:p>
             <w:pPr>
+              <w:pStyle w:val="Normal"/>
               <w:jc w:val="center"/>
               <w:pBdr>
                 <w:bottom w:val="none" w:sz="0" w:space="0" w:color="000000"/>
@@ -4289,6 +4357,7 @@
           </w:tcPr>
           <w:p>
             <w:pPr>
+              <w:pStyle w:val="Normal"/>
               <w:jc w:val="center"/>
               <w:pBdr>
                 <w:bottom w:val="none" w:sz="0" w:space="0" w:color="000000"/>
@@ -4343,6 +4412,7 @@
           </w:tcPr>
           <w:p>
             <w:pPr>
+              <w:pStyle w:val="Normal"/>
               <w:jc w:val="center"/>
               <w:pBdr>
                 <w:bottom w:val="none" w:sz="0" w:space="0" w:color="000000"/>
@@ -4397,6 +4467,7 @@
           </w:tcPr>
           <w:p>
             <w:pPr>
+              <w:pStyle w:val="Normal"/>
               <w:jc w:val="center"/>
               <w:pBdr>
                 <w:bottom w:val="none" w:sz="0" w:space="0" w:color="000000"/>
@@ -4451,6 +4522,7 @@
           </w:tcPr>
           <w:p>
             <w:pPr>
+              <w:pStyle w:val="Normal"/>
               <w:jc w:val="center"/>
               <w:pBdr>
                 <w:bottom w:val="none" w:sz="0" w:space="0" w:color="000000"/>

</xml_diff>